<commit_message>
completed the template problem
</commit_message>
<xml_diff>
--- a/backend/templates/export_insurance.docx
+++ b/backend/templates/export_insurance.docx
@@ -302,21 +302,19 @@
           <w:b/>
           <w:sz w:val="26"/>
         </w:rPr>
-        <w:t xml:space="preserve"> </w:t>
-      </w:r>
-      <w:r>
-        <w:rPr>
-          <w:rFonts w:ascii="Times New Roman" w:eastAsia="Times New Roman" w:hAnsi="Times New Roman" w:cs="Times New Roman"/>
-          <w:sz w:val="26"/>
-        </w:rPr>
-        <w:t xml:space="preserve">Covering all risk from </w:t>
-      </w:r>
-      <w:r>
-        <w:rPr>
-          <w:rFonts w:ascii="Times New Roman" w:eastAsia="Times New Roman" w:hAnsi="Times New Roman" w:cs="Times New Roman"/>
-          <w:sz w:val="26"/>
-        </w:rPr>
-        <w:t xml:space="preserve">NAMAKKAL WARE HOUSE TO </w:t>
+        <w:t xml:space="preserve"> Covering all risk from NAMAKKAL WARE HOUSE TO {{ buyer_address }}</w:t>
+      </w:r>
+      <w:r>
+        <w:rPr>
+          <w:rFonts w:ascii="Times New Roman" w:eastAsia="Times New Roman" w:hAnsi="Times New Roman" w:cs="Times New Roman"/>
+          <w:sz w:val="26"/>
+        </w:rPr>
+      </w:r>
+      <w:r>
+        <w:rPr>
+          <w:rFonts w:ascii="Times New Roman" w:eastAsia="Times New Roman" w:hAnsi="Times New Roman" w:cs="Times New Roman"/>
+          <w:sz w:val="26"/>
+        </w:rPr>
       </w:r>
     </w:p>
     <w:p>
@@ -765,7 +763,13 @@
           <w:rFonts w:ascii="Times New Roman" w:eastAsia="Times New Roman" w:hAnsi="Times New Roman" w:cs="Times New Roman"/>
           <w:sz w:val="20"/>
         </w:rPr>
-        <w:t>Name  and</w:t>
+        <w:t>Name  and Address</w:t>
+        <w:br/>
+        <w:t>Of Importer</w:t>
+        <w:br/>
+        <w:t>{{ importer_name }}</w:t>
+        <w:br/>
+        <w:t>{{ importer_address }}</w:t>
       </w:r>
       <w:proofErr w:type="gramEnd"/>
       <w:r>
@@ -773,14 +777,12 @@
           <w:rFonts w:ascii="Times New Roman" w:eastAsia="Times New Roman" w:hAnsi="Times New Roman" w:cs="Times New Roman"/>
           <w:sz w:val="20"/>
         </w:rPr>
-        <w:t xml:space="preserve"> Address </w:t>
       </w:r>
       <w:r>
         <w:rPr>
           <w:rFonts w:ascii="Times New Roman" w:eastAsia="Times New Roman" w:hAnsi="Times New Roman" w:cs="Times New Roman"/>
           <w:sz w:val="20"/>
         </w:rPr>
-        <w:tab/>
       </w:r>
       <w:r>
         <w:rPr>
@@ -788,7 +790,6 @@
           <w:b/>
           <w:sz w:val="20"/>
         </w:rPr>
-        <w:br/>
       </w:r>
       <w:r>
         <w:rPr>
@@ -796,7 +797,6 @@
           <w:b/>
           <w:sz w:val="24"/>
         </w:rPr>
-        <w:t>Of Importer</w:t>
       </w:r>
       <w:r>
         <w:rPr>
@@ -804,7 +804,6 @@
           <w:b/>
           <w:sz w:val="20"/>
         </w:rPr>
-        <w:t xml:space="preserve">  </w:t>
       </w:r>
       <w:r>
         <w:rPr>
@@ -812,117 +811,11 @@
           <w:b/>
           <w:sz w:val="20"/>
         </w:rPr>
-        <w:t xml:space="preserve">     </w:t>
       </w:r>
       <w:r>
         <w:rPr>
           <w:noProof/>
         </w:rPr>
-        <mc:AlternateContent>
-          <mc:Choice Requires="wpg">
-            <w:drawing>
-              <wp:inline distT="0" distB="0" distL="0" distR="0" wp14:anchorId="3986977D" wp14:editId="7B6E5F76">
-                <wp:extent cx="91440" cy="457200"/>
-                <wp:effectExtent l="0" t="0" r="0" b="0"/>
-                <wp:docPr id="1721" name="Group 1721"/>
-                <wp:cNvGraphicFramePr/>
-                <a:graphic xmlns:a="http://schemas.openxmlformats.org/drawingml/2006/main">
-                  <a:graphicData uri="http://schemas.microsoft.com/office/word/2010/wordprocessingGroup">
-                    <wpg:wgp>
-                      <wpg:cNvGrpSpPr/>
-                      <wpg:grpSpPr>
-                        <a:xfrm>
-                          <a:off x="0" y="0"/>
-                          <a:ext cx="91440" cy="457200"/>
-                          <a:chOff x="0" y="0"/>
-                          <a:chExt cx="91440" cy="457200"/>
-                        </a:xfrm>
-                      </wpg:grpSpPr>
-                      <wps:wsp>
-                        <wps:cNvPr id="287" name="Shape 287"/>
-                        <wps:cNvSpPr/>
-                        <wps:spPr>
-                          <a:xfrm>
-                            <a:off x="0" y="0"/>
-                            <a:ext cx="91440" cy="457200"/>
-                          </a:xfrm>
-                          <a:custGeom>
-                            <a:avLst/>
-                            <a:gdLst/>
-                            <a:ahLst/>
-                            <a:cxnLst/>
-                            <a:rect l="0" t="0" r="0" b="0"/>
-                            <a:pathLst>
-                              <a:path w="91440" h="457200">
-                                <a:moveTo>
-                                  <a:pt x="0" y="0"/>
-                                </a:moveTo>
-                                <a:cubicBezTo>
-                                  <a:pt x="25273" y="0"/>
-                                  <a:pt x="45720" y="17018"/>
-                                  <a:pt x="45720" y="38100"/>
-                                </a:cubicBezTo>
-                                <a:lnTo>
-                                  <a:pt x="45720" y="190500"/>
-                                </a:lnTo>
-                                <a:cubicBezTo>
-                                  <a:pt x="45720" y="211582"/>
-                                  <a:pt x="66167" y="228600"/>
-                                  <a:pt x="91440" y="228600"/>
-                                </a:cubicBezTo>
-                                <a:cubicBezTo>
-                                  <a:pt x="66167" y="228600"/>
-                                  <a:pt x="45720" y="245618"/>
-                                  <a:pt x="45720" y="266700"/>
-                                </a:cubicBezTo>
-                                <a:lnTo>
-                                  <a:pt x="45720" y="419100"/>
-                                </a:lnTo>
-                                <a:cubicBezTo>
-                                  <a:pt x="45720" y="440182"/>
-                                  <a:pt x="25273" y="457200"/>
-                                  <a:pt x="0" y="457200"/>
-                                </a:cubicBezTo>
-                              </a:path>
-                            </a:pathLst>
-                          </a:custGeom>
-                          <a:ln w="9525" cap="flat">
-                            <a:round/>
-                          </a:ln>
-                        </wps:spPr>
-                        <wps:style>
-                          <a:lnRef idx="1">
-                            <a:srgbClr val="000000"/>
-                          </a:lnRef>
-                          <a:fillRef idx="0">
-                            <a:srgbClr val="000000">
-                              <a:alpha val="0"/>
-                            </a:srgbClr>
-                          </a:fillRef>
-                          <a:effectRef idx="0">
-                            <a:scrgbClr r="0" g="0" b="0"/>
-                          </a:effectRef>
-                          <a:fontRef idx="none"/>
-                        </wps:style>
-                        <wps:bodyPr/>
-                      </wps:wsp>
-                    </wpg:wgp>
-                  </a:graphicData>
-                </a:graphic>
-              </wp:inline>
-            </w:drawing>
-          </mc:Choice>
-          <mc:Fallback>
-            <w:pict>
-              <v:group w14:anchorId="5D8AD9FC" id="Group 1721" o:spid="_x0000_s1026" style="width:7.2pt;height:36pt;mso-position-horizontal-relative:char;mso-position-vertical-relative:line" coordsize="91440,457200" o:gfxdata="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">
-                <v:shape id="Shape 287" o:spid="_x0000_s1027" style="position:absolute;width:91440;height:457200;visibility:visible;mso-wrap-style:square;v-text-anchor:top" coordsize="91440,457200" o:gfxdata="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" path="m,c25273,,45720,17018,45720,38100r,152400c45720,211582,66167,228600,91440,228600v-25273,,-45720,17018,-45720,38100l45720,419100v,21082,-20447,38100,-45720,38100e" filled="f">
-                  <v:path arrowok="t" textboxrect="0,0,91440,457200"/>
-                </v:shape>
-                <w10:anchorlock/>
-              </v:group>
-            </w:pict>
-          </mc:Fallback>
-        </mc:AlternateContent>
       </w:r>
       <w:r>
         <w:rPr>
@@ -930,8 +823,6 @@
           <w:b/>
           <w:sz w:val="20"/>
         </w:rPr>
-        <w:tab/>
-        <w:t xml:space="preserve">   </w:t>
       </w:r>
       <w:r>
         <w:rPr>
@@ -939,7 +830,6 @@
           <w:b/>
           <w:sz w:val="20"/>
         </w:rPr>
-        <w:t xml:space="preserve"> </w:t>
       </w:r>
     </w:p>
     <w:p>
@@ -1271,49 +1161,11 @@
         <w:t xml:space="preserve">             Kindly   do the needful at you’re earliest and oblige </w:t>
       </w:r>
     </w:p>
-    <w:p>
-      <w:pPr>
-        <w:spacing w:after="122"/>
-      </w:pPr>
-      <w:r>
-        <w:rPr>
-          <w:rFonts w:ascii="Times New Roman" w:eastAsia="Times New Roman" w:hAnsi="Times New Roman" w:cs="Times New Roman"/>
-          <w:sz w:val="26"/>
-        </w:rPr>
-        <w:t xml:space="preserve"> </w:t>
-      </w:r>
-    </w:p>
-    <w:p>
-      <w:pPr>
-        <w:spacing w:after="0"/>
-      </w:pPr>
-      <w:r>
-        <w:rPr>
-          <w:rFonts w:ascii="Times New Roman" w:eastAsia="Times New Roman" w:hAnsi="Times New Roman" w:cs="Times New Roman"/>
-          <w:sz w:val="26"/>
-        </w:rPr>
-        <w:t xml:space="preserve"> </w:t>
-      </w:r>
-    </w:p>
-    <w:p>
-      <w:pPr>
-        <w:spacing w:after="0"/>
-      </w:pPr>
-      <w:r>
-        <w:rPr>
-          <w:rFonts w:ascii="Times New Roman" w:eastAsia="Times New Roman" w:hAnsi="Times New Roman" w:cs="Times New Roman"/>
-          <w:sz w:val="20"/>
-        </w:rPr>
-        <w:t xml:space="preserve">                                 </w:t>
-      </w:r>
-    </w:p>
     <w:sectPr>
-      <w:titlePg/>
       <w:headerReference w:type="default" r:id="rId6"/>
       <w:footerReference w:type="default" r:id="rId7"/>
-      <w:headerReference w:type="first" r:id="rId8"/>
       <w:pgSz w:w="12240" w:h="20160"/>
-      <w:pgMar w:top="3456" w:right="0" w:bottom="216" w:left="504" w:header="144" w:footer="720" w:gutter="0"/>
+      <w:pgMar w:top="1440" w:right="644" w:bottom="1440" w:left="1268" w:header="720" w:footer="720" w:gutter="0"/>
       <w:cols w:space="720"/>
     </w:sectPr>
   </w:body>
@@ -1333,53 +1185,9 @@
 <file path=word/header1.xml><?xml version="1.0" encoding="utf-8"?>
 <w:hdr xmlns:m="http://schemas.openxmlformats.org/officeDocument/2006/math" xmlns:mc="http://schemas.openxmlformats.org/markup-compatibility/2006" xmlns:mo="http://schemas.microsoft.com/office/mac/office/2008/main" xmlns:mv="urn:schemas-microsoft-com:mac:vml" xmlns:o="urn:schemas-microsoft-com:office:office" xmlns:r="http://schemas.openxmlformats.org/officeDocument/2006/relationships" xmlns:v="urn:schemas-microsoft-com:vml" xmlns:w10="urn:schemas-microsoft-com:office:word" xmlns:w14="http://schemas.microsoft.com/office/word/2010/wordml" xmlns:w="http://schemas.openxmlformats.org/wordprocessingml/2006/main" xmlns:wne="http://schemas.microsoft.com/office/word/2006/wordml" xmlns:wp14="http://schemas.microsoft.com/office/word/2010/wordprocessingDrawing" xmlns:wp="http://schemas.openxmlformats.org/drawingml/2006/wordprocessingDrawing" xmlns:wpc="http://schemas.microsoft.com/office/word/2010/wordprocessingCanvas" xmlns:wpg="http://schemas.microsoft.com/office/word/2010/wordprocessingGroup" xmlns:wpi="http://schemas.microsoft.com/office/word/2010/wordprocessingInk" xmlns:wps="http://schemas.microsoft.com/office/word/2010/wordprocessingShape" mc:Ignorable="w14 wp14">
   <w:p>
-    <w:pPr/>
-  </w:p>
-</w:hdr>
-</file>
-
-<file path=word/header2.xml><?xml version="1.0" encoding="utf-8"?>
-<w:hdr xmlns:m="http://schemas.openxmlformats.org/officeDocument/2006/math" xmlns:mc="http://schemas.openxmlformats.org/markup-compatibility/2006" xmlns:mo="http://schemas.microsoft.com/office/mac/office/2008/main" xmlns:mv="urn:schemas-microsoft-com:mac:vml" xmlns:o="urn:schemas-microsoft-com:office:office" xmlns:r="http://schemas.openxmlformats.org/officeDocument/2006/relationships" xmlns:v="urn:schemas-microsoft-com:vml" xmlns:w10="urn:schemas-microsoft-com:office:word" xmlns:w14="http://schemas.microsoft.com/office/word/2010/wordml" xmlns:w="http://schemas.openxmlformats.org/wordprocessingml/2006/main" xmlns:wne="http://schemas.microsoft.com/office/word/2006/wordml" xmlns:wp14="http://schemas.microsoft.com/office/word/2010/wordprocessingDrawing" xmlns:wp="http://schemas.openxmlformats.org/drawingml/2006/wordprocessingDrawing" xmlns:wpc="http://schemas.microsoft.com/office/word/2010/wordprocessingCanvas" xmlns:wpg="http://schemas.microsoft.com/office/word/2010/wordprocessingGroup" xmlns:wpi="http://schemas.microsoft.com/office/word/2010/wordprocessingInk" xmlns:wps="http://schemas.microsoft.com/office/word/2010/wordprocessingShape" mc:Ignorable="w14 wp14">
-  <w:p>
     <w:pPr>
-      <w:spacing w:before="0" w:after="0" w:line="240" w:lineRule="auto"/>
-      <w:ind w:left="216"/>
-      <w:jc w:val="left"/>
+      <w:pStyle w:val="Header"/>
     </w:pPr>
-    <w:r>
-      <w:drawing>
-        <wp:inline xmlns:a="http://schemas.openxmlformats.org/drawingml/2006/main" xmlns:pic="http://schemas.openxmlformats.org/drawingml/2006/picture">
-          <wp:extent cx="6858000" cy="2094168"/>
-          <wp:docPr id="1" name="Picture 1"/>
-          <wp:cNvGraphicFramePr>
-            <a:graphicFrameLocks noChangeAspect="1"/>
-          </wp:cNvGraphicFramePr>
-          <a:graphic>
-            <a:graphicData uri="http://schemas.openxmlformats.org/drawingml/2006/picture">
-              <pic:pic>
-                <pic:nvPicPr>
-                  <pic:cNvPr id="0" name="frame.jpeg"/>
-                  <pic:cNvPicPr/>
-                </pic:nvPicPr>
-                <pic:blipFill>
-                  <a:blip r:embed="rId1"/>
-                  <a:stretch>
-                    <a:fillRect/>
-                  </a:stretch>
-                </pic:blipFill>
-                <pic:spPr>
-                  <a:xfrm>
-                    <a:off x="0" y="0"/>
-                    <a:ext cx="6858000" cy="2094168"/>
-                  </a:xfrm>
-                  <a:prstGeom prst="rect"/>
-                </pic:spPr>
-              </pic:pic>
-            </a:graphicData>
-          </a:graphic>
-        </wp:inline>
-      </w:drawing>
-    </w:r>
   </w:p>
 </w:hdr>
 </file>

</xml_diff>